<commit_message>
Rewrite W05 weekly update in instructor's stage-format
Reformatted Weekly Update to match the explicit instructor spec from the
course Assignment Instructions: one paragraph per substage (1a-1c, 2a-2b,
3a-3d, 4a) with 'No update' where appropriate, progress-only (no
repetition of previous week), and stage identification up front.

Replaces the longer narrative version. Same content distilled into the
required format. Catch-up note acknowledges the W02-W04 reporting gap
and the missed-update fact without excuses.
</commit_message>
<xml_diff>
--- a/dba/Weekly_Update_W05_2026-06-14.docx
+++ b/dba/Weekly_Update_W05_2026-06-14.docx
@@ -7,730 +7,203 @@
         <w:pStyle w:val="Heading1"/>
       </w:pPr>
       <w:r>
-        <w:t>WEEKLY PROJECT UPDATE — Week 5 (Catch-Up)</w:t>
+        <w:t>Student Project Update — Yasir A. Malik</w:t>
       </w:r>
     </w:p>
     <w:p>
       <w:r>
-        <w:t>DBA Research Project · Qualifying Examination</w:t>
-      </w:r>
-    </w:p>
-    <w:p>
-      <w:pPr>
-        <w:pStyle w:val="Heading2"/>
-      </w:pPr>
-      <w:r>
-        <w:t>Honest header</w:t>
+        <w:rPr>
+          <w:b/>
+        </w:rPr>
+        <w:t>PID 1687105 | Cohort 7.16 | GEB7913</w:t>
       </w:r>
     </w:p>
     <w:p>
       <w:r>
-        <w:t>Two weekly updates were missed (W02 and W03). This update covers the W02–W04 reporting period and re-baselines Week 5 commitments. The READY packet I prepared on June 1 in response to Dr. Rey's instructions has been on the project branch the whole time; the gap was in execution, not in deliverables.</w:t>
+        <w:rPr>
+          <w:b/>
+        </w:rPr>
+        <w:t>Submitted:</w:t>
+      </w:r>
+      <w:r>
+        <w:t xml:space="preserve"> Sunday, June 14, 2026</w:t>
       </w:r>
     </w:p>
     <w:p>
-      <w:pPr>
-        <w:pStyle w:val="Heading2"/>
-      </w:pPr>
-      <w:r>
-        <w:t>Current Stage(s)</w:t>
-      </w:r>
-    </w:p>
-    <w:p>
-      <w:pPr>
-        <w:pStyle w:val="ListBullet"/>
-      </w:pPr>
       <w:r>
         <w:rPr>
           <w:b/>
         </w:rPr>
-        <w:t>Stage 1 — Instrument</w:t>
+        <w:t>Reporting period:</w:t>
       </w:r>
       <w:r>
-        <w:t xml:space="preserve"> (PRIMARY this week — Qualtrics build is the gating activity)</w:t>
+        <w:t xml:space="preserve"> Catch-up covering June 1 – June 14, 2026 (Weeks 2–4 of 9 missed; Week 5 in progress)</w:t>
       </w:r>
     </w:p>
     <w:p>
-      <w:pPr>
-        <w:pStyle w:val="ListBullet"/>
-      </w:pPr>
       <w:r>
         <w:rPr>
           <w:b/>
         </w:rPr>
-        <w:t>Stage 2 — Informed Pilot</w:t>
+        <w:t>Current stage:</w:t>
       </w:r>
       <w:r>
-        <w:t xml:space="preserve"> (READY packet filed, awaiting Stage 1 closure)</w:t>
+        <w:t xml:space="preserve"> Stage 2 — Qualtrics and Survey Instrument (PRIMARY); Stage 1 (READY, awaiting Stage 2a closure); Stage 4 (in maintenance)</w:t>
       </w:r>
     </w:p>
+    <w:p/>
     <w:p>
-      <w:pPr>
-        <w:pStyle w:val="ListBullet"/>
-      </w:pPr>
       <w:r>
         <w:rPr>
           <w:b/>
         </w:rPr>
-        <w:t>Stage 3 — Recruiting platforms</w:t>
+        <w:t>Stage 1a — Recruitment and Solicitation materials.</w:t>
       </w:r>
       <w:r>
-        <w:t xml:space="preserve"> (CloudResearch + MTurk drafts READY)</w:t>
-      </w:r>
-    </w:p>
-    <w:p>
-      <w:pPr>
-        <w:pStyle w:val="ListBullet"/>
-      </w:pPr>
-      <w:r>
-        <w:rPr>
-          <w:b/>
-        </w:rPr>
-        <w:t>Stage 0 — IRB:</w:t>
-      </w:r>
-      <w:r>
-        <w:t xml:space="preserve"> Protocol IRB-25-0462 active; Topaz PI-change amendment outstanding</w:t>
-      </w:r>
-    </w:p>
-    <w:p>
-      <w:pPr>
-        <w:pStyle w:val="Heading2"/>
-      </w:pPr>
-      <w:r>
-        <w:t>What changed during W02–W04</w:t>
-      </w:r>
-    </w:p>
-    <w:p>
-      <w:pPr>
-        <w:pStyle w:val="ListBullet"/>
-      </w:pPr>
-      <w:r>
-        <w:rPr>
-          <w:b/>
-        </w:rPr>
-        <w:t>June 1:</w:t>
-      </w:r>
-      <w:r>
-        <w:t xml:space="preserve"> Built and committed the full READY packet to the project repo in response to Dr. Rey's feedback: revised paper (v4.1 → v4.2), informed-pilot protocol, feedback/revision workbook, CloudResearch and MTurk launch drafts, recruiting launch checklist, interactive dashboard, build-and-launch guide.</w:t>
-      </w:r>
-    </w:p>
-    <w:p>
-      <w:pPr>
-        <w:pStyle w:val="ListBullet"/>
-      </w:pPr>
-      <w:r>
-        <w:rPr>
-          <w:b/>
-        </w:rPr>
-        <w:t>June 1–14:</w:t>
-      </w:r>
-      <w:r>
-        <w:t xml:space="preserve"> Did not advance the Qualtrics build, the face-validity meeting, or the pilot launch. No new IRB activity. No advisor communication.</w:t>
-      </w:r>
-    </w:p>
-    <w:p>
-      <w:pPr>
-        <w:pStyle w:val="ListBullet"/>
-      </w:pPr>
-      <w:r>
-        <w:rPr>
-          <w:b/>
-        </w:rPr>
-        <w:t>Repo state today:</w:t>
-      </w:r>
-      <w:r>
-        <w:t xml:space="preserve"> clean, pushed, branch </w:t>
+        <w:t xml:space="preserve"> Completed full READY packet: CloudResearch Launch Draft (study listing, eligibility filters, soft-launch protocol, quality filters), MTurk Backup Launch Draft (HIT language + use condition), LinkedIn Outreach Pack (three IRB-aligned templates), and Recruiting Launch Checklist (five gate tabs: Pre-Pilot, Pilot Close-Out, CloudResearch, MTurk Backup, Stop Conditions). Informed-pilot recipient profile defined: 6–10 LinkedIn auditor contacts meeting IRB eligibility (≥2 years audit experience, long-term-engagement exposure). All artifacts filed on the project branch at </w:t>
       </w:r>
       <w:r>
         <w:rPr>
           <w:rFonts w:ascii="Consolas" w:hAnsi="Consolas"/>
           <w:sz w:val="20"/>
         </w:rPr>
-        <w:t>claude/scholar-links-review-Plgk6</w:t>
+        <w:t>dba/03_Recruitment_and_Pilot/</w:t>
       </w:r>
       <w:r>
-        <w:t>. Every artifact named below is at a verifiable commit.</w:t>
+        <w:t>.</w:t>
       </w:r>
     </w:p>
     <w:p>
-      <w:pPr>
-        <w:pStyle w:val="Heading2"/>
-      </w:pPr>
-      <w:r>
-        <w:t>Re-baselined plan for Week 5 (June 15–21)</w:t>
-      </w:r>
-    </w:p>
-    <w:tbl>
-      <w:tblPr>
-        <w:tblStyle w:val="LightGrid-Accent1"/>
-        <w:tblW w:type="auto" w:w="0"/>
-        <w:tblLook w:firstColumn="1" w:firstRow="1" w:lastColumn="0" w:lastRow="0" w:noHBand="0" w:noVBand="1" w:val="04A0"/>
-      </w:tblPr>
-      <w:tblGrid>
-        <w:gridCol w:w="3120"/>
-        <w:gridCol w:w="3120"/>
-        <w:gridCol w:w="3120"/>
-      </w:tblGrid>
-      <w:tr>
-        <w:tc>
-          <w:tcPr>
-            <w:tcW w:type="dxa" w:w="3120"/>
-          </w:tcPr>
-          <w:p>
-            <w:pPr>
-              <w:spacing w:line="240" w:lineRule="auto"/>
-            </w:pPr>
-            <w:r/>
-            <w:r>
-              <w:t>Date</w:t>
-            </w:r>
-          </w:p>
-        </w:tc>
-        <w:tc>
-          <w:tcPr>
-            <w:tcW w:type="dxa" w:w="3120"/>
-          </w:tcPr>
-          <w:p>
-            <w:pPr>
-              <w:spacing w:line="240" w:lineRule="auto"/>
-            </w:pPr>
-            <w:r/>
-            <w:r>
-              <w:t>Deliverable</w:t>
-            </w:r>
-          </w:p>
-        </w:tc>
-        <w:tc>
-          <w:tcPr>
-            <w:tcW w:type="dxa" w:w="3120"/>
-          </w:tcPr>
-          <w:p>
-            <w:pPr>
-              <w:spacing w:line="240" w:lineRule="auto"/>
-            </w:pPr>
-            <w:r/>
-            <w:r>
-              <w:t>Status gate</w:t>
-            </w:r>
-          </w:p>
-        </w:tc>
-      </w:tr>
-      <w:tr>
-        <w:tc>
-          <w:tcPr>
-            <w:tcW w:type="dxa" w:w="3120"/>
-          </w:tcPr>
-          <w:p>
-            <w:pPr>
-              <w:spacing w:line="240" w:lineRule="auto"/>
-            </w:pPr>
-            <w:r/>
-            <w:r>
-              <w:t>Mon June 15</w:t>
-            </w:r>
-          </w:p>
-        </w:tc>
-        <w:tc>
-          <w:tcPr>
-            <w:tcW w:type="dxa" w:w="3120"/>
-          </w:tcPr>
-          <w:p>
-            <w:pPr>
-              <w:spacing w:line="240" w:lineRule="auto"/>
-            </w:pPr>
-            <w:r/>
-            <w:r>
-              <w:t>Open dashboard; reconcile first 3 constructs (TA, RA, AT) against IRB-approved instrument</w:t>
-            </w:r>
-          </w:p>
-        </w:tc>
-        <w:tc>
-          <w:tcPr>
-            <w:tcW w:type="dxa" w:w="3120"/>
-          </w:tcPr>
-          <w:p>
-            <w:pPr>
-              <w:spacing w:line="240" w:lineRule="auto"/>
-            </w:pPr>
-            <w:r/>
-            <w:r>
-              <w:t>Begin reconciliation log</w:t>
-            </w:r>
-          </w:p>
-        </w:tc>
-      </w:tr>
-      <w:tr>
-        <w:tc>
-          <w:tcPr>
-            <w:tcW w:type="dxa" w:w="3120"/>
-          </w:tcPr>
-          <w:p>
-            <w:pPr>
-              <w:spacing w:line="240" w:lineRule="auto"/>
-            </w:pPr>
-            <w:r/>
-            <w:r>
-              <w:t>Tue June 16</w:t>
-            </w:r>
-          </w:p>
-        </w:tc>
-        <w:tc>
-          <w:tcPr>
-            <w:tcW w:type="dxa" w:w="3120"/>
-          </w:tcPr>
-          <w:p>
-            <w:pPr>
-              <w:spacing w:line="240" w:lineRule="auto"/>
-            </w:pPr>
-            <w:r/>
-            <w:r>
-              <w:t>Finish reconciliation across all 11 constructs; commit reconciled item list</w:t>
-            </w:r>
-          </w:p>
-        </w:tc>
-        <w:tc>
-          <w:tcPr>
-            <w:tcW w:type="dxa" w:w="3120"/>
-          </w:tcPr>
-          <w:p>
-            <w:pPr>
-              <w:spacing w:line="240" w:lineRule="auto"/>
-            </w:pPr>
-            <w:r/>
-            <w:r>
-              <w:t>Reconciliation log filed</w:t>
-            </w:r>
-          </w:p>
-        </w:tc>
-      </w:tr>
-      <w:tr>
-        <w:tc>
-          <w:tcPr>
-            <w:tcW w:type="dxa" w:w="3120"/>
-          </w:tcPr>
-          <w:p>
-            <w:pPr>
-              <w:spacing w:line="240" w:lineRule="auto"/>
-            </w:pPr>
-            <w:r/>
-            <w:r>
-              <w:t>Wed June 17</w:t>
-            </w:r>
-          </w:p>
-        </w:tc>
-        <w:tc>
-          <w:tcPr>
-            <w:tcW w:type="dxa" w:w="3120"/>
-          </w:tcPr>
-          <w:p>
-            <w:pPr>
-              <w:spacing w:line="240" w:lineRule="auto"/>
-            </w:pPr>
-            <w:r/>
-            <w:r>
-              <w:t>Build consent + screeners + first 5 construct blocks in Qualtrics</w:t>
-            </w:r>
-          </w:p>
-        </w:tc>
-        <w:tc>
-          <w:tcPr>
-            <w:tcW w:type="dxa" w:w="3120"/>
-          </w:tcPr>
-          <w:p>
-            <w:pPr>
-              <w:spacing w:line="240" w:lineRule="auto"/>
-            </w:pPr>
-            <w:r/>
-            <w:r>
-              <w:t>Mid-build commit</w:t>
-            </w:r>
-          </w:p>
-        </w:tc>
-      </w:tr>
-      <w:tr>
-        <w:tc>
-          <w:tcPr>
-            <w:tcW w:type="dxa" w:w="3120"/>
-          </w:tcPr>
-          <w:p>
-            <w:pPr>
-              <w:spacing w:line="240" w:lineRule="auto"/>
-            </w:pPr>
-            <w:r/>
-            <w:r>
-              <w:t>Thu June 18</w:t>
-            </w:r>
-          </w:p>
-        </w:tc>
-        <w:tc>
-          <w:tcPr>
-            <w:tcW w:type="dxa" w:w="3120"/>
-          </w:tcPr>
-          <w:p>
-            <w:pPr>
-              <w:spacing w:line="240" w:lineRule="auto"/>
-            </w:pPr>
-            <w:r/>
-            <w:r>
-              <w:t>Finish remaining 6 construct blocks + demographics + randomizer + anonymity settings</w:t>
-            </w:r>
-          </w:p>
-        </w:tc>
-        <w:tc>
-          <w:tcPr>
-            <w:tcW w:type="dxa" w:w="3120"/>
-          </w:tcPr>
-          <w:p>
-            <w:pPr>
-              <w:spacing w:line="240" w:lineRule="auto"/>
-            </w:pPr>
-            <w:r/>
-            <w:r>
-              <w:t>Preview test passes</w:t>
-            </w:r>
-          </w:p>
-        </w:tc>
-      </w:tr>
-      <w:tr>
-        <w:tc>
-          <w:tcPr>
-            <w:tcW w:type="dxa" w:w="3120"/>
-          </w:tcPr>
-          <w:p>
-            <w:pPr>
-              <w:spacing w:line="240" w:lineRule="auto"/>
-            </w:pPr>
-            <w:r/>
-            <w:r>
-              <w:t>Fri June 19</w:t>
-            </w:r>
-          </w:p>
-        </w:tc>
-        <w:tc>
-          <w:tcPr>
-            <w:tcW w:type="dxa" w:w="3120"/>
-          </w:tcPr>
-          <w:p>
-            <w:pPr>
-              <w:spacing w:line="240" w:lineRule="auto"/>
-            </w:pPr>
-            <w:r/>
-            <w:r>
-              <w:t>Brief Zoom with Dr. Rey: face-validity sign-off, LinkedIn copy sign-off, CloudResearch compensation amount</w:t>
-            </w:r>
-          </w:p>
-        </w:tc>
-        <w:tc>
-          <w:tcPr>
-            <w:tcW w:type="dxa" w:w="3120"/>
-          </w:tcPr>
-          <w:p>
-            <w:pPr>
-              <w:spacing w:line="240" w:lineRule="auto"/>
-            </w:pPr>
-            <w:r/>
-            <w:r>
-              <w:t>Three sign-offs in hand</w:t>
-            </w:r>
-          </w:p>
-        </w:tc>
-      </w:tr>
-      <w:tr>
-        <w:tc>
-          <w:tcPr>
-            <w:tcW w:type="dxa" w:w="3120"/>
-          </w:tcPr>
-          <w:p>
-            <w:pPr>
-              <w:spacing w:line="240" w:lineRule="auto"/>
-            </w:pPr>
-            <w:r/>
-            <w:r>
-              <w:t>Sat June 20</w:t>
-            </w:r>
-          </w:p>
-        </w:tc>
-        <w:tc>
-          <w:tcPr>
-            <w:tcW w:type="dxa" w:w="3120"/>
-          </w:tcPr>
-          <w:p>
-            <w:pPr>
-              <w:spacing w:line="240" w:lineRule="auto"/>
-            </w:pPr>
-            <w:r/>
-            <w:r>
-              <w:t>Send pilot invitations to 6–10 LinkedIn audit contacts</w:t>
-            </w:r>
-          </w:p>
-        </w:tc>
-        <w:tc>
-          <w:tcPr>
-            <w:tcW w:type="dxa" w:w="3120"/>
-          </w:tcPr>
-          <w:p>
-            <w:pPr>
-              <w:spacing w:line="240" w:lineRule="auto"/>
-            </w:pPr>
-            <w:r/>
-            <w:r>
-              <w:t>P01–P10 logged</w:t>
-            </w:r>
-          </w:p>
-        </w:tc>
-      </w:tr>
-      <w:tr>
-        <w:tc>
-          <w:tcPr>
-            <w:tcW w:type="dxa" w:w="3120"/>
-          </w:tcPr>
-          <w:p>
-            <w:pPr>
-              <w:spacing w:line="240" w:lineRule="auto"/>
-            </w:pPr>
-            <w:r/>
-            <w:r>
-              <w:t>Sun June 21</w:t>
-            </w:r>
-          </w:p>
-        </w:tc>
-        <w:tc>
-          <w:tcPr>
-            <w:tcW w:type="dxa" w:w="3120"/>
-          </w:tcPr>
-          <w:p>
-            <w:pPr>
-              <w:spacing w:line="240" w:lineRule="auto"/>
-            </w:pPr>
-            <w:r/>
-            <w:r>
-              <w:t>Pilot collection underway (target ≥6 by Wed June 24)</w:t>
-            </w:r>
-          </w:p>
-        </w:tc>
-        <w:tc>
-          <w:tcPr>
-            <w:tcW w:type="dxa" w:w="3120"/>
-          </w:tcPr>
-          <w:p>
-            <w:pPr>
-              <w:spacing w:line="240" w:lineRule="auto"/>
-            </w:pPr>
-            <w:r/>
-            <w:r>
-              <w:t>Pilot active</w:t>
-            </w:r>
-          </w:p>
-        </w:tc>
-      </w:tr>
-    </w:tbl>
-    <w:p>
-      <w:pPr>
-        <w:spacing w:after="0"/>
-      </w:pPr>
-    </w:p>
-    <w:p>
-      <w:pPr>
-        <w:pStyle w:val="Heading2"/>
-      </w:pPr>
-      <w:r>
-        <w:t>Risks and how I'm handling them</w:t>
-      </w:r>
-    </w:p>
-    <w:p>
-      <w:pPr>
-        <w:pStyle w:val="ListBullet"/>
-      </w:pPr>
       <w:r>
         <w:rPr>
           <w:b/>
         </w:rPr>
-        <w:t>Risk: another execution gap.</w:t>
+        <w:t>Stage 1b — Executing the Informed Pilot.</w:t>
       </w:r>
       <w:r>
-        <w:t xml:space="preserve"> Mitigation: daily commit cadence on the project branch; missing a day triggers a one-line note to Dr. Rey, no excuses.</w:t>
+        <w:t xml:space="preserve"> No update. Pilot launches when Stage 2a closes. Protocol READY: Informed Pilot Protocol document, Feedback Form (PF1–PF10), anonymous Participant Log (P01–P10), Revision Log (severity-tagged with IRB-scope flag column), and Decision Summary (six launch-gating criteria).</w:t>
       </w:r>
     </w:p>
     <w:p>
-      <w:pPr>
-        <w:pStyle w:val="ListBullet"/>
-      </w:pPr>
       <w:r>
         <w:rPr>
           <w:b/>
         </w:rPr>
-        <w:t>Risk: IRB-scope drift during pilot.</w:t>
+        <w:t>Stage 1c — Documenting the informed pilot in the manuscript.</w:t>
       </w:r>
       <w:r>
-        <w:t xml:space="preserve"> Mitigation: the READY decision rules already specify that any scope-affecting feedback halts revision and escalates to advisor / Topaz before any change.</w:t>
+        <w:t xml:space="preserve"> No update.</w:t>
       </w:r>
     </w:p>
     <w:p>
-      <w:pPr>
-        <w:pStyle w:val="ListBullet"/>
-      </w:pPr>
       <w:r>
         <w:rPr>
           <w:b/>
         </w:rPr>
-        <w:t>Risk: CloudResearch yield insufficient.</w:t>
+        <w:t>Stage 2a — Design and implementation in Qualtrics.</w:t>
       </w:r>
       <w:r>
-        <w:t xml:space="preserve"> Mitigation: MTurk backup draft is READY; LinkedIn parallel channel provides 30–40 of the n=60–80 target.</w:t>
+        <w:t xml:space="preserve"> No update. Item set finalized in paper Appendix A: 55 construct items (5 per factor × 11 factors) + 12 demographic items, one reverse-coded item per construct, two embedded attention checks, page timers planned. Reconciliation against the IRB-approved instrument scheduled for Tuesday, June 16; Qualtrics build and preview testing scheduled for Wednesday–Thursday, June 17–18.</w:t>
       </w:r>
     </w:p>
     <w:p>
-      <w:pPr>
-        <w:pStyle w:val="ListBullet"/>
-      </w:pPr>
       <w:r>
         <w:rPr>
           <w:b/>
         </w:rPr>
-        <w:t>Risk: July 19 manuscript milestone.</w:t>
+        <w:t>Stage 2b — Integration into MTurk / CloudResearch.</w:t>
       </w:r>
       <w:r>
-        <w:t xml:space="preserve"> Mitigation: re-baselined plan preserves a 3-week data collection window (June 29 – July 12) and a 1-week analysis-and-write window before the milestone.</w:t>
-      </w:r>
-    </w:p>
-    <w:p>
-      <w:pPr>
-        <w:pStyle w:val="Heading2"/>
-      </w:pPr>
-      <w:r>
-        <w:t>What I am asking Dr. Rey for</w:t>
-      </w:r>
-    </w:p>
-    <w:p>
-      <w:pPr>
-        <w:pStyle w:val="ListNumber"/>
-      </w:pPr>
-      <w:r>
-        <w:t>A 20-minute Zoom this week (any time on or before Friday June 19)</w:t>
-      </w:r>
-    </w:p>
-    <w:p>
-      <w:pPr>
-        <w:pStyle w:val="ListNumber"/>
-      </w:pPr>
-      <w:r>
-        <w:t>Face-validity sign-off on the Qualtrics build during that Zoom</w:t>
-      </w:r>
-    </w:p>
-    <w:p>
-      <w:pPr>
-        <w:pStyle w:val="ListNumber"/>
-      </w:pPr>
-      <w:r>
-        <w:t>Sign-off on the LinkedIn outreach copy (3 templates)</w:t>
-      </w:r>
-    </w:p>
-    <w:p>
-      <w:pPr>
-        <w:pStyle w:val="ListNumber"/>
-      </w:pPr>
-      <w:r>
-        <w:t>Confirmation of the CloudResearch compensation amount</w:t>
-      </w:r>
-    </w:p>
-    <w:p>
-      <w:pPr>
-        <w:pStyle w:val="Heading2"/>
-      </w:pPr>
-      <w:r>
-        <w:t>Boundaries I am holding to</w:t>
-      </w:r>
-    </w:p>
-    <w:p>
-      <w:pPr>
-        <w:pStyle w:val="ListBullet"/>
-      </w:pPr>
-      <w:r>
-        <w:t>No AI/LLM items in this survey (reserved for future research)</w:t>
-      </w:r>
-    </w:p>
-    <w:p>
-      <w:pPr>
-        <w:pStyle w:val="ListBullet"/>
-      </w:pPr>
-      <w:r>
-        <w:t>No employer / client / account-level / sensitive personal data</w:t>
-      </w:r>
-    </w:p>
-    <w:p>
-      <w:pPr>
-        <w:pStyle w:val="ListBullet"/>
-      </w:pPr>
-      <w:r>
-        <w:t>Wording-and-flow-only revisions during the pilot; any scope-affecting change halts for advisor + IRB</w:t>
-      </w:r>
-    </w:p>
-    <w:p>
-      <w:pPr>
-        <w:pStyle w:val="Heading2"/>
-      </w:pPr>
-      <w:r>
-        <w:t>Schedule snapshot</w:t>
-      </w:r>
-    </w:p>
-    <w:p>
-      <w:pPr>
-        <w:pStyle w:val="ListBullet"/>
-      </w:pPr>
-      <w:r>
-        <w:t>Now: closing Week 4 / opening Week 5 of 9</w:t>
-      </w:r>
-    </w:p>
-    <w:p>
-      <w:pPr>
-        <w:pStyle w:val="ListBullet"/>
-      </w:pPr>
-      <w:r>
-        <w:t>Pilot window: June 20 – June 27</w:t>
-      </w:r>
-    </w:p>
-    <w:p>
-      <w:pPr>
-        <w:pStyle w:val="ListBullet"/>
-      </w:pPr>
-      <w:r>
-        <w:t>CloudResearch data window: June 29 – July 12</w:t>
-      </w:r>
-    </w:p>
-    <w:p>
-      <w:pPr>
-        <w:pStyle w:val="ListBullet"/>
-      </w:pPr>
-      <w:r>
-        <w:t>Analysis + Chapter 5 write: July 13 – July 18</w:t>
-      </w:r>
-    </w:p>
-    <w:p>
-      <w:pPr>
-        <w:pStyle w:val="ListBullet"/>
-      </w:pPr>
-      <w:r>
-        <w:t>Stage 4a manuscript milestone: July 19, 2026</w:t>
+        <w:t xml:space="preserve"> Both platform launch drafts completed. Sequencing locked: CloudResearch primary (soft-launch 10–15 responses, then scale toward n = 60–80 valid post-cleaning), MTurk backup only if CloudResearch yield or quality is insufficient. Routing pattern set: anonymous FIU Qualtrics link with platform-side redirect / completion-code return; no participant identifiers collected inside Qualtrics.</w:t>
       </w:r>
     </w:p>
     <w:p>
       <w:r>
-        <w:br w:type="page"/>
+        <w:rPr>
+          <w:b/>
+        </w:rPr>
+        <w:t>Stage 3a — Recruitment and Data Collection.</w:t>
+      </w:r>
+      <w:r>
+        <w:t xml:space="preserve"> No update.</w:t>
       </w:r>
     </w:p>
     <w:p>
       <w:r>
-        <w:t>Student: Yasir A. Malik (PID 1687105) | Cohort 7.16</w:t>
+        <w:rPr>
+          <w:b/>
+        </w:rPr>
+        <w:t>Stage 3b — Data cleaning and scrubbing.</w:t>
+      </w:r>
+      <w:r>
+        <w:t xml:space="preserve"> No update.</w:t>
       </w:r>
     </w:p>
     <w:p>
       <w:r>
-        <w:t>Advisor: Prof. Dr. Juan Rey, FIU DBA Program</w:t>
+        <w:rPr>
+          <w:b/>
+        </w:rPr>
+        <w:t>Stage 3c — Descriptive Analysis.</w:t>
+      </w:r>
+      <w:r>
+        <w:t xml:space="preserve"> No update.</w:t>
       </w:r>
     </w:p>
     <w:p>
       <w:r>
-        <w:t>Submitted: Sunday, June 14, 2026</w:t>
+        <w:rPr>
+          <w:b/>
+        </w:rPr>
+        <w:t>Stage 3d — Factor Analysis and revisions based on loadings.</w:t>
+      </w:r>
+      <w:r>
+        <w:t xml:space="preserve"> No update.</w:t>
+      </w:r>
+    </w:p>
+    <w:p>
+      <w:r>
+        <w:rPr>
+          <w:b/>
+        </w:rPr>
+        <w:t>Stage 4a — Finalize the manuscript.</w:t>
+      </w:r>
+      <w:r>
+        <w:t xml:space="preserve"> Substantial progress during the catch-up window. Manuscript expanded from v3 (~10 pages) to v4.2 (~40 pages double-spaced). Chapter 2 reorganized into one section per construct (all 11) with a full theory section introducing five behavioral and audit accounts (anchoring-and-adjustment, selective accessibility, dual-process, belief-adjustment, audit-quality frameworks); dual-process theory selected and justified as the focal lens. Chapter 3 now contains the embedded research-model figure (eight intervention IVs → AJQ / APR mediators → RAB dependent variable) and one dedicated section per hypothesis (sixteen total), each titled by origin–destination relationship and ending in the formal "Thus, Hypothesis k states that…" statement. Measurement instrument relocated to Appendix A. Verified reference pool established with approximately 45 sources; every in-text citation web-verified against source (venue, year, pages). v4.2 cleanup removed drafting-scaffold callouts and two reference entries that were not cited in the body.</w:t>
+      </w:r>
+    </w:p>
+    <w:p/>
+    <w:p>
+      <w:r>
+        <w:rPr>
+          <w:b/>
+        </w:rPr>
+        <w:t>Re-baselined plan, Week 5 (June 15–21).</w:t>
+      </w:r>
+      <w:r>
+        <w:t xml:space="preserve"> Tue Jun 16: Stage 2a — Appendix A reconciled against the IRB-approved instrument. Thu Jun 18: Stage 2a — Qualtrics build complete and preview-tested across eligible and screen-out paths. Fri Jun 19: 20-minute advisor Zoom (face-validity sign-off, LinkedIn outreach copy sign-off, CloudResearch compensation amount confirmation). Sat Jun 20: Stage 1b — pilot invitations sent to 6–10 LinkedIn audit contacts. Wed Jun 24: Stage 1b — pilot responses collected; decision rules applied; in-scope revisions logged. Mon Jun 29: Stage 3a — CloudResearch soft-launch (10–15 responses). This plan preserves the Stage 4a manuscript milestone of July 19, 2026.</w:t>
+      </w:r>
+    </w:p>
+    <w:p>
+      <w:r>
+        <w:rPr>
+          <w:b/>
+        </w:rPr>
+        <w:t>Note on the catch-up.</w:t>
+      </w:r>
+      <w:r>
+        <w:t xml:space="preserve"> No weekly updates were submitted for Weeks 2, 3, or 4. The READY packet referenced above was filed to the project branch on June 1, 2026 in direct response to advisor feedback that day, but downstream execution (Qualtrics build, pilot invitations) did not begin. Restarting this week with a daily commit cadence on the project branch as the forcing function.</w:t>
+      </w:r>
+    </w:p>
+    <w:p>
+      <w:r>
+        <w:rPr>
+          <w:b/>
+        </w:rPr>
+        <w:t>Repository:</w:t>
+      </w:r>
+      <w:r>
+        <w:t xml:space="preserve"> https://github.com/AuditingAI/Profile/tree/claude/scholar-links-review-Plgk6/dba</w:t>
       </w:r>
     </w:p>
     <w:sectPr>
@@ -1107,7 +580,7 @@
     <w:qFormat/>
     <w:rsid w:val="00FC693F"/>
     <w:pPr>
-      <w:spacing w:line="276" w:lineRule="auto" w:after="80"/>
+      <w:spacing w:line="276" w:lineRule="auto" w:after="120"/>
     </w:pPr>
     <w:rPr>
       <w:rFonts w:ascii="Times New Roman" w:hAnsi="Times New Roman" w:eastAsia="Times New Roman"/>

</xml_diff>